<commit_message>
Fill the empty sections of Kerry's specification.
Leave the existing tables, diagrams, and written sections in place, and add the journey, flows, database, API, security, and limitations from the current code.

Co-authored-by: UCT Karabo Tigedi <Karabo22Tigedi@users.noreply.github.com>
</commit_message>
<xml_diff>
--- a/ECO5040W_Business_And_Tech_Specification_kerrys.docx
+++ b/ECO5040W_Business_And_Tech_Specification_kerrys.docx
@@ -2346,6 +2346,7 @@
     </w:p>
     <w:p>
       <w:pPr>
+        <w:pStyle w:val="NormalWeb"/>
         <w:tabs>
           <w:tab w:val="left" w:pos="1856"/>
         </w:tabs>
@@ -2353,9 +2354,17 @@
           <w:lang w:val="en-US"/>
         </w:rPr>
       </w:pPr>
-    </w:p>
-    <w:p>
-      <w:pPr>
+      <w:r>
+        <w:rPr>
+          <w:rFonts w:ascii="Segoe UI" w:hAnsi="Segoe UI"/>
+          <w:sz w:val="20"/>
+        </w:rPr>
+        <w:t>Registration collects a full name, email address, mobile number and password, and always creates a customer account. Email and mobile number must be unique. Signing in returns a bearer token kept for that browser session. A customer lands on the home screen. An administrator, who is not created by public registration, lands on the KYC queue. The same customer account can send and, once linked as a beneficiary, receive.</w:t>
+      </w:r>
+    </w:p>
+    <w:p>
+      <w:pPr>
+        <w:pStyle w:val="NormalWeb"/>
         <w:tabs>
           <w:tab w:val="left" w:pos="1856"/>
         </w:tabs>
@@ -2363,6 +2372,13 @@
           <w:lang w:val="en-US"/>
         </w:rPr>
       </w:pPr>
+      <w:r>
+        <w:rPr>
+          <w:rFonts w:ascii="Segoe UI" w:hAnsi="Segoe UI"/>
+          <w:sz w:val="20"/>
+        </w:rPr>
+        <w:t>Profile lets the customer change name, email and mobile number. KYC is a separate form: identity, address and source of funds. Submitting it sets the application to pending. An administrator approves it, or rejects it with a reason. An approved application cannot be edited. A rejected one can be overwritten and sent again. Sending, adding a beneficiary and cashing out stay closed until KYC is approved. Holding UCTUSD does not require it.</w:t>
+      </w:r>
     </w:p>
     <w:p>
       <w:pPr>
@@ -2493,6 +2509,7 @@
     </w:p>
     <w:p>
       <w:pPr>
+        <w:pStyle w:val="NormalWeb"/>
         <w:tabs>
           <w:tab w:val="left" w:pos="1856"/>
         </w:tabs>
@@ -2501,6 +2518,25 @@
           <w:lang w:val="en-US"/>
         </w:rPr>
       </w:pPr>
+      <w:r>
+        <w:rPr>
+          <w:rFonts w:ascii="Segoe UI" w:hAnsi="Segoe UI"/>
+          <w:sz w:val="20"/>
+        </w:rPr>
+        <w:t>An approved sender chooses a beneficiary and a rand amount and confirms. That locks a quote for fifteen minutes, including the fee, the rate after the margin, and the UCTUSD amount (the field is still named rlusd_amount). While the quote is live the sender may cancel it, which releases the limit, or start a simulated cash-in by agent cash, bank transfer or card. An administrator then confirms that the rand was received. Only that confirmation places a settlement message on the Redis stream.</w:t>
+      </w:r>
+    </w:p>
+    <w:p>
+      <w:pPr>
+        <w:pStyle w:val="NormalWeb"/>
+      </w:pPr>
+      <w:r>
+        <w:rPr>
+          <w:rFonts w:ascii="Segoe UI" w:hAnsi="Segoe UI"/>
+          <w:sz w:val="20"/>
+        </w:rPr>
+        <w:t>An administrator runs the settlement worker, or a worker process is already running. The worker submits a UCTUSD Payment from the platform treasury to the linked recipient’s custodial Testnet account. On success the spendable balance is credited and the transaction hash is stored. On failure the balance is not credited and the reason is kept. Retry puts a failed or stuck message back on the queue. It does not settle by itself.</w:t>
+      </w:r>
     </w:p>
     <w:p>
       <w:pPr>
@@ -2601,6 +2637,7 @@
     </w:p>
     <w:p>
       <w:pPr>
+        <w:pStyle w:val="NormalWeb"/>
         <w:tabs>
           <w:tab w:val="left" w:pos="1856"/>
         </w:tabs>
@@ -2613,6 +2650,25 @@
           <w:lang w:val="en-US"/>
         </w:rPr>
       </w:pPr>
+      <w:r>
+        <w:rPr>
+          <w:rFonts w:ascii="Segoe UI" w:hAnsi="Segoe UI"/>
+          <w:sz w:val="20"/>
+        </w:rPr>
+        <w:t>The recipient’s Testnet account is created at the first successful settlement, and only for a linked user. The wallet shows a spendable balance and an on-chain figure, incoming transfers with status and hash, and cash-out history. Spendable is the amount that can be cashed out. The on-chain figure shown here is spendable plus amounts still reserved on cash-outs that are requested or approved.</w:t>
+      </w:r>
+    </w:p>
+    <w:p>
+      <w:pPr>
+        <w:pStyle w:val="NormalWeb"/>
+      </w:pPr>
+      <w:r>
+        <w:rPr>
+          <w:rFonts w:ascii="Segoe UI" w:hAnsi="Segoe UI"/>
+          <w:sz w:val="20"/>
+        </w:rPr>
+        <w:t>Cash-out requires approved KYC. The recipient asks for a UCTUSD amount in US dollars or rand. That amount is reserved at once by reducing spendable, so two requests cannot overdraw the same balance. An administrator approves, then completes or fails the request. Complete sends the reserved UCTUSD to the issuer. Fail returns it to spendable. The fiat amount is calculated and stored. It is not paid by a bank.</w:t>
+      </w:r>
     </w:p>
     <w:p>
       <w:pPr>
@@ -13950,8 +14006,16 @@
     </w:p>
     <w:p>
       <w:pPr>
+        <w:pStyle w:val="NormalWeb"/>
         <w:spacing w:before="120" w:after="120"/>
       </w:pPr>
+      <w:r>
+        <w:rPr>
+          <w:rFonts w:ascii="Segoe UI" w:hAnsi="Segoe UI"/>
+          <w:sz w:val="20"/>
+        </w:rPr>
+        <w:t>The running system is the web application, the JSON API, the database, Redis Streams, the settlement worker, and the XRP Ledger Testnet. Redis only carries the settlement instruction. The remittance row and the settlement message are the record. The treasury is one platform Testnet account. Each linked recipient receives their own custodial Testnet account on first settlement. Spendable balance is the internal ledger on the wallet row, not a live balance read from the recipient’s trust line.</w:t>
+      </w:r>
     </w:p>
     <w:p>
       <w:pPr>
@@ -13981,6 +14045,42 @@
     </w:p>
     <w:p>
       <w:pPr>
+        <w:pStyle w:val="NormalWeb"/>
+      </w:pPr>
+      <w:r>
+        <w:rPr>
+          <w:rFonts w:ascii="Segoe UI" w:hAnsi="Segoe UI"/>
+          <w:sz w:val="20"/>
+        </w:rPr>
+        <w:t>Cash-in starts from a quote that is still quoted, not cancelled, and not past its expiry. The sender posts one method: agent cash, bank transfer, or card. The remittance stores that label and the time, and moves to cash-in pending. The method is not sent to a bank, a card acquirer, or an agent. No settlement message is created at this step, and no XRP Ledger Payment is submitted.</w:t>
+      </w:r>
+    </w:p>
+    <w:p>
+      <w:pPr>
+        <w:pStyle w:val="NormalWeb"/>
+      </w:pPr>
+      <w:r>
+        <w:rPr>
+          <w:rFonts w:ascii="Segoe UI" w:hAnsi="Segoe UI"/>
+          <w:sz w:val="20"/>
+        </w:rPr>
+        <w:t>Only an administrator can confirm the cash-in, and only from cash-in pending. Confirmation records who confirmed it and when. It is the stand-in for a payment service saying the rand was received. Settlement is enqueued only inside that confirmation. The remittance then becomes settlement queued. Confirming does not itself submit the Payment. The worker does that later, when it reads the queue.</w:t>
+      </w:r>
+    </w:p>
+    <w:p>
+      <w:pPr>
+        <w:pStyle w:val="NormalWeb"/>
+      </w:pPr>
+      <w:r>
+        <w:rPr>
+          <w:rFonts w:ascii="Segoe UI" w:hAnsi="Segoe UI"/>
+          <w:sz w:val="20"/>
+        </w:rPr>
+        <w:t>From cash-in pending onward the rand amount keeps counting toward the sender’s daily and monthly limits, including if settlement later fails. A cancelled quote cannot be cashed in. An expired quote cannot be cashed in, and cash-in on it returns 409.</w:t>
+      </w:r>
+    </w:p>
+    <w:p>
+      <w:pPr>
         <w:pStyle w:val="ListParagraph"/>
         <w:numPr>
           <w:ilvl w:val="0"/>
@@ -14000,6 +14100,54 @@
     </w:p>
     <w:p>
       <w:pPr>
+        <w:pStyle w:val="NormalWeb"/>
+      </w:pPr>
+      <w:r>
+        <w:rPr>
+          <w:rFonts w:ascii="Segoe UI" w:hAnsi="Segoe UI"/>
+          <w:sz w:val="20"/>
+        </w:rPr>
+        <w:t>The brief calls this the RLUSD settlement flow. The token the worker actually pays is UCTUSD, issued by the configured Testnet account. Quote and wallet fields are still named with rlusd. That name is the amount. The ledger payment uses the configured UCTUSD currency code.</w:t>
+      </w:r>
+    </w:p>
+    <w:p>
+      <w:pPr>
+        <w:pStyle w:val="NormalWeb"/>
+      </w:pPr>
+      <w:r>
+        <w:rPr>
+          <w:rFonts w:ascii="Segoe UI" w:hAnsi="Segoe UI"/>
+          <w:sz w:val="20"/>
+        </w:rPr>
+        <w:t>Confirming cash-in inserts one settlement message per remittance and publishes its identifier on the Redis stream settlement_messages. If that row already exists but the stream entry was never stored, the same row is published again, so a Redis failure after the database commit does not leave the remittance stranded. The worker reads its own unacknowledged entries, then idle entries waiting on the pending list, then new entries. It acknowledges an entry only after the message is completed or failed. A crash before that leaves the entry to be picked up again.</w:t>
+      </w:r>
+    </w:p>
+    <w:p>
+      <w:pPr>
+        <w:pStyle w:val="NormalWeb"/>
+      </w:pPr>
+      <w:r>
+        <w:rPr>
+          <w:rFonts w:ascii="Segoe UI" w:hAnsi="Segoe UI"/>
+          <w:sz w:val="20"/>
+        </w:rPr>
+        <w:t>The worker will not pay unless the beneficiary is linked to a registered user, the platform wallet has a TrustLine to the UCTUSD issuer, and the treasury holds enough UCTUSD. It creates the recipient’s Testnet account and TrustLine if they are not there yet, then submits a Payment of the quoted amount from the treasury to that account. The remittance identifier is the Payment memo. The ledger result must be tesSUCCESS.</w:t>
+      </w:r>
+    </w:p>
+    <w:p>
+      <w:pPr>
+        <w:pStyle w:val="NormalWeb"/>
+      </w:pPr>
+      <w:r>
+        <w:rPr>
+          <w:rFonts w:ascii="Segoe UI" w:hAnsi="Segoe UI"/>
+          <w:sz w:val="20"/>
+        </w:rPr>
+        <w:t>On success the spendable balance is increased, the remittance is marked settled, and the transaction hash is stored, in one database commit. On failure the balance is not increased and the reason is stored on the message and the remittance. A message already completed, or a remittance that already has a hash, is not paid or credited again. An administrator can retry a pending, processing, or failed message by putting a new entry on the stream. A completed settlement cannot be retried. If the Payment has already succeeded and the process dies before the commit that stores the hash, a later pass will not see the hash and can submit a second Payment. Once the hash is stored, that does not happen.</w:t>
+      </w:r>
+    </w:p>
+    <w:p>
+      <w:pPr>
         <w:pStyle w:val="ListParagraph"/>
         <w:numPr>
           <w:ilvl w:val="0"/>
@@ -14031,6 +14179,42 @@
           <w:highlight w:val="cyan"/>
         </w:rPr>
         <w:commentReference w:id="0"/>
+      </w:r>
+    </w:p>
+    <w:p>
+      <w:pPr>
+        <w:pStyle w:val="NormalWeb"/>
+      </w:pPr>
+      <w:r>
+        <w:rPr>
+          <w:rFonts w:ascii="Segoe UI" w:hAnsi="Segoe UI"/>
+          <w:sz w:val="20"/>
+        </w:rPr>
+        <w:t>A recipient can hold UCTUSD without approved KYC, but requesting a cash-out requires it. The request freezes the fee, the rate and the fiat payout on the cash-out row, and reserves the full token amount by reducing spendable in one conditional update. If the balance is too small, the request is refused and spendable is unchanged. USD pays one dollar per token after the cash-out fee. Rand uses the live or fallback USD/ZAR rate with no FX margin. Those figures are not recalculated when an administrator later approves or completes the request.</w:t>
+      </w:r>
+    </w:p>
+    <w:p>
+      <w:pPr>
+        <w:pStyle w:val="NormalWeb"/>
+      </w:pPr>
+      <w:r>
+        <w:rPr>
+          <w:rFonts w:ascii="Segoe UI" w:hAnsi="Segoe UI"/>
+          <w:sz w:val="20"/>
+        </w:rPr>
+        <w:t>The wallet shows two numbers. Spendable is the internal balance after the reservation. The on-chain figure is not read live from the XRP Ledger. It is spendable plus the token amounts on this user’s cash-outs that are still requested or approved, which are the tokens still sitting in the custodial account. After a failure, spendable is credited back and the two figures meet. After completion, spendable stays reduced and the on-chain figure drops with it, because the reserved tokens have been paid to the issuer.</w:t>
+      </w:r>
+    </w:p>
+    <w:p>
+      <w:pPr>
+        <w:pStyle w:val="NormalWeb"/>
+      </w:pPr>
+      <w:r>
+        <w:rPr>
+          <w:rFonts w:ascii="Segoe UI" w:hAnsi="Segoe UI"/>
+          <w:sz w:val="20"/>
+        </w:rPr>
+        <w:t>Approval does not submit a ledger transaction. Completion is allowed only from approved, and only when the custodial wallet has an address, a secret and a TrustLine. It submits a Payment of the reserved UCTUSD to the issuer and stores the burn hash. If that hash is already stored, a second Payment is not sent. If the ledger rejects the Payment, the cash-out stays approved so it can be tried again. Failing a requested or approved cash-out refunds spendable. A completed cash-out cannot be failed. No bank payment is made at any step.</w:t>
       </w:r>
     </w:p>
     <w:p>
@@ -14243,6 +14427,54 @@
     </w:p>
     <w:p>
       <w:pPr>
+        <w:pStyle w:val="NormalWeb"/>
+      </w:pPr>
+      <w:r>
+        <w:rPr>
+          <w:rFonts w:ascii="Segoe UI" w:hAnsi="Segoe UI"/>
+          <w:sz w:val="20"/>
+        </w:rPr>
+        <w:t>Users are the centre of the schema. Each account has a unique email and mobile number, a password hash, and a role of customer or administrator. Sessions store only the SHA-256 hash of the bearer token, an expiry, and the time the session was revoked. KYC is one row per user. Resubmitting a rejected application updates that same row. The identification number is encrypted. The other KYC fields are not.</w:t>
+      </w:r>
+    </w:p>
+    <w:p>
+      <w:pPr>
+        <w:pStyle w:val="NormalWeb"/>
+      </w:pPr>
+      <w:r>
+        <w:rPr>
+          <w:rFonts w:ascii="Segoe UI" w:hAnsi="Segoe UI"/>
+          <w:sz w:val="20"/>
+        </w:rPr>
+        <w:t>A beneficiary belongs to a sender and may point at a registered user when the mobile number or email matches. A remittance always belongs to a sender and a beneficiary. It is created as a quote, with the rate and fees stored on the row, a tracking reference of MG plus ten digits, and an expiry. Its status then moves through cash-in and settlement. A successful settlement stores the transaction hash on that row.</w:t>
+      </w:r>
+    </w:p>
+    <w:p>
+      <w:pPr>
+        <w:pStyle w:val="NormalWeb"/>
+      </w:pPr>
+      <w:r>
+        <w:rPr>
+          <w:rFonts w:ascii="Segoe UI" w:hAnsi="Segoe UI"/>
+          <w:sz w:val="20"/>
+        </w:rPr>
+        <w:t>There is one settlement message per remittance. It holds the queue status, the attempt count, the failure reason, and the Redis stream entry. Each recipient has at most one wallet row: a spendable balance, a Testnet address, an encrypted secret, and a trust-line flag. The platform wallet is a single treasury row, with its own encrypted secret. Cash-out requests belong to a user and are not tied to one remittance. They debit the spendable balance when they are requested, and completion stores the burn hash. Fees live on one configuration row. Limit tiers hold the unverified and verified daily and monthly caps. The tier applied to a person comes from whether their KYC is approved, not from a column on the user.</w:t>
+      </w:r>
+    </w:p>
+    <w:p>
+      <w:pPr>
+        <w:pStyle w:val="NormalWeb"/>
+      </w:pPr>
+      <w:r>
+        <w:rPr>
+          <w:rFonts w:ascii="Segoe UI" w:hAnsi="Segoe UI"/>
+          <w:sz w:val="20"/>
+        </w:rPr>
+        <w:t>Alembic revision 0001_initial created these tables. Revision 0002_quote_session replaced the stored session token with its hash and added the tracking reference, the quote expiry, and the cancelled status. Revision 0003_cash_out_burn added the burn transaction hash on a cash-out.</w:t>
+      </w:r>
+    </w:p>
+    <w:p>
+      <w:pPr>
         <w:pStyle w:val="ListParagraph"/>
         <w:numPr>
           <w:ilvl w:val="0"/>
@@ -14273,6 +14505,42 @@
     </w:p>
     <w:p>
       <w:pPr>
+        <w:pStyle w:val="NormalWeb"/>
+      </w:pPr>
+      <w:r>
+        <w:rPr>
+          <w:rFonts w:ascii="Segoe UI" w:hAnsi="Segoe UI"/>
+          <w:sz w:val="20"/>
+        </w:rPr>
+        <w:t>The API is JSON over HTTP. Register and login do not need an existing session. Login returns an opaque bearer token, its expiry, and the user. Later calls send that token as Authorization: Bearer. The database stores only the SHA-256 hash of the token. Logout revokes that session immediately, so the same token stops working. Interactive documentation is at /docs, and GET /health does not require a login.</w:t>
+      </w:r>
+    </w:p>
+    <w:p>
+      <w:pPr>
+        <w:pStyle w:val="NormalWeb"/>
+      </w:pPr>
+      <w:r>
+        <w:rPr>
+          <w:rFonts w:ascii="Segoe UI" w:hAnsi="Segoe UI"/>
+          <w:sz w:val="20"/>
+        </w:rPr>
+        <w:t>Customers use the API for their own profile, KYC, beneficiaries, quotes, cash-in, cancellation, history, limits, wallet and cash-out requests. Adding a beneficiary, creating a quote and requesting a cash-out require approved KYC. Administrators review KYC, confirm cash-in, approve, complete or fail cash-outs, edit fees and limit tiers, inspect the platform wallet, and run or retry settlement. Both roles sign in through the same login. Each route checks which one is calling.</w:t>
+      </w:r>
+    </w:p>
+    <w:p>
+      <w:pPr>
+        <w:pStyle w:val="NormalWeb"/>
+      </w:pPr>
+      <w:r>
+        <w:rPr>
+          <w:rFonts w:ascii="Segoe UI" w:hAnsi="Segoe UI"/>
+          <w:sz w:val="20"/>
+        </w:rPr>
+        <w:t>Looking up a remittance by its MG tracking reference is not public. The sender, the linked recipient, or an administrator may see it. Any other signed-in user is refused. Senders also have a list of the remittances they created. A linked recipient sees incoming transfers on the wallet rather than on that send history.</w:t>
+      </w:r>
+    </w:p>
+    <w:p>
+      <w:pPr>
         <w:pStyle w:val="ListParagraph"/>
         <w:numPr>
           <w:ilvl w:val="0"/>
@@ -14298,6 +14566,42 @@
     </w:p>
     <w:p>
       <w:pPr>
+        <w:pStyle w:val="NormalWeb"/>
+      </w:pPr>
+      <w:r>
+        <w:rPr>
+          <w:rFonts w:ascii="Segoe UI" w:hAnsi="Segoe UI"/>
+          <w:sz w:val="20"/>
+        </w:rPr>
+        <w:t>Passwords are stored as bcrypt hashes and are never returned. Login creates an unguessable bearer token and stores only its SHA-256 hash. The raw token is handed back once. A session lasts twelve hours unless it is logged out sooner. Logout sets the time the session was revoked, and a later call with that token is rejected. Other sessions for the same person stay valid until they expire or are logged out.</w:t>
+      </w:r>
+    </w:p>
+    <w:p>
+      <w:pPr>
+        <w:pStyle w:val="NormalWeb"/>
+      </w:pPr>
+      <w:r>
+        <w:rPr>
+          <w:rFonts w:ascii="Segoe UI" w:hAnsi="Segoe UI"/>
+          <w:sz w:val="20"/>
+        </w:rPr>
+        <w:t>Two separate encryption keys are read from the environment, not from the database. One encrypts the KYC identification number. The other encrypts the platform and recipient XRP Ledger secrets. A leak of one key does not decrypt the other. Wallet and platform-wallet responses include addresses and balances and do not include secrets. Secrets are decrypted only in the code that signs a TrustSet or a Payment. The identification number is decrypted when a KYC record is read, so the applicant and an administrator reviewing the application can see it.</w:t>
+      </w:r>
+    </w:p>
+    <w:p>
+      <w:pPr>
+        <w:pStyle w:val="NormalWeb"/>
+      </w:pPr>
+      <w:r>
+        <w:rPr>
+          <w:rFonts w:ascii="Segoe UI" w:hAnsi="Segoe UI"/>
+          <w:sz w:val="20"/>
+        </w:rPr>
+        <w:t>Mobile numbers are checked as 8 to 15 digits, and identification numbers as 6 to 20 characters. That is a format check. It is not a one-time password, and it is not a check against Home Affairs or a passport authority. Approval is still a separate decision by an administrator.</w:t>
+      </w:r>
+    </w:p>
+    <w:p>
+      <w:pPr>
         <w:pStyle w:val="ListParagraph"/>
         <w:numPr>
           <w:ilvl w:val="0"/>
@@ -14324,6 +14628,18 @@
     </w:p>
     <w:p>
       <w:pPr>
+        <w:pStyle w:val="NormalWeb"/>
+      </w:pPr>
+      <w:r>
+        <w:rPr>
+          <w:rFonts w:ascii="Segoe UI" w:hAnsi="Segoe UI"/>
+          <w:sz w:val="20"/>
+        </w:rPr>
+        <w:t>The legal position is set out under Regulatory Considerations above. In the prototype, those duties appear only as the controls the software actually has: a KYC application, administrator approval before sending or cashing out, daily and monthly rand caps, and encrypted storage of the identification number and of the ledger secrets. The software does not screen sanctions lists, does not file reports, and does not hold a licence. Cash-in and fiat cash-out are simulated, so the system does not take rand or pay out dollars.</w:t>
+      </w:r>
+    </w:p>
+    <w:p>
+      <w:pPr>
         <w:pStyle w:val="ListParagraph"/>
         <w:numPr>
           <w:ilvl w:val="0"/>
@@ -14345,6 +14661,42 @@
           <w:highlight w:val="magenta"/>
         </w:rPr>
         <w:t>ssumptions and limitations.</w:t>
+      </w:r>
+    </w:p>
+    <w:p>
+      <w:pPr>
+        <w:pStyle w:val="NormalWeb"/>
+      </w:pPr>
+      <w:r>
+        <w:rPr>
+          <w:rFonts w:ascii="Segoe UI" w:hAnsi="Segoe UI"/>
+          <w:sz w:val="20"/>
+        </w:rPr>
+        <w:t>One customer account is used both to send and to receive. Administrators are created outside public registration. Beneficiaries are linked by matching mobile number or email, including when the recipient registers later. There is no invitation message. A person without approved KYC can register, hold UCTUSD and open the wallet, but cannot add a beneficiary, lock a quote or cash out. That block is a refusal for missing KYC, not a journey that reaches the unverified R0 cap and fails there.</w:t>
+      </w:r>
+    </w:p>
+    <w:p>
+      <w:pPr>
+        <w:pStyle w:val="NormalWeb"/>
+      </w:pPr>
+      <w:r>
+        <w:rPr>
+          <w:rFonts w:ascii="Segoe UI" w:hAnsi="Segoe UI"/>
+          <w:sz w:val="20"/>
+        </w:rPr>
+        <w:t>The on-ledger asset is UCTUSD on the XRP Ledger Testnet, unless the issuer and currency code in configuration are changed. One token is treated as one US dollar in the fee arithmetic. Quotes expire after 900 seconds. Cash-in methods are labels only. Cash-out fiat is US dollars or rand only. The default database is SQLite, and Redis must be running for a confirmed cash-in to be picked up by the worker.</w:t>
+      </w:r>
+    </w:p>
+    <w:p>
+      <w:pPr>
+        <w:pStyle w:val="NormalWeb"/>
+      </w:pPr>
+      <w:r>
+        <w:rPr>
+          <w:rFonts w:ascii="Segoe UI" w:hAnsi="Segoe UI"/>
+          <w:sz w:val="20"/>
+        </w:rPr>
+        <w:t>The daily and monthly check reads current usage and then inserts the quote. Nothing locks the sender’s rows between those two steps, so two quotes submitted together can both pass and together exceed the cap. Settlement will not pay twice once the transaction hash has been saved. A crash after the ledger has accepted the Payment and before that save can still submit it again. The automated tests replace the ledger calls, so they do not show a live Testnet payment. There is no sanctions or transaction-monitoring engine in the application.</w:t>
       </w:r>
     </w:p>
     <w:p>

</xml_diff>

<commit_message>
Correct the specification where it disagreed with the code.
The false regulatory, fee, limit, and settlement sentences now match the prototype, and a KYC rejection requires a reason. Cash-out failure refunds the cash-out user.

Co-authored-by: UCT Karabo Tigedi <Karabo22Tigedi@users.noreply.github.com>
</commit_message>
<xml_diff>
--- a/ECO5040W_Business_And_Tech_Specification_kerrys.docx
+++ b/ECO5040W_Business_And_Tech_Specification_kerrys.docx
@@ -1673,7 +1673,7 @@
           <w:szCs w:val="22"/>
           <w:lang w:val="en-US"/>
         </w:rPr>
-        <w:t>It delivers a complete service from rand to cash, targets a total cost below that of the digital providers by settling in a stablecoin, and gives the recipient the option to hold the funds as dollar value rather than cash out immediately.</w:t>
+        <w:t>It delivers a complete service from rand to cash by settling in a stablecoin, and gives the recipient the option to hold the funds as dollar value rather than cash out immediately. At the default fees the sender pays a R25 fixed fee, 1% of the amount, and a 2% exchange-rate margin, and the quote adds an estimated 1.5% cash-out fee. That is not a total cost below the digital providers in the table, and it is not under the 3% target.</w:t>
       </w:r>
     </w:p>
     <w:p>
@@ -1817,7 +1817,7 @@
           <w:szCs w:val="22"/>
           <w:lang w:val="en-US"/>
         </w:rPr>
-        <w:t>The platform's KYC process collects identity, address and source-of-funds information and allows only approved users to send money, and its daily and monthly limits provide the transaction controls a monitored service requires.</w:t>
+        <w:t>The prototype collects mock KYC, blocks send and cash-out until an administrator approves, and enforces daily and monthly ZAR caps; those caps are not an AML monitoring or reporting engine.</w:t>
       </w:r>
       <w:r>
         <w:br/>
@@ -1899,7 +1899,7 @@
           <w:szCs w:val="22"/>
           <w:lang w:val="en-US"/>
         </w:rPr>
-        <w:t>The second concerns moving money across the border, which the South African Reserve Bank regulates. Wise, for instance, was only able to start serving South African customers after the Reserve Bank conditionally approved it as an Authorised Dealer in Foreign Exchange with Limited Authority (Wise, 2025). The platform needs the same kind of licence, or a partnership with a dealer that already holds one. Holding that authorisation also means enforcing the Reserve Bank's limits on how much customers may send abroad. Each resident can currently send up to R2 million a year without special approval (South African Reserve Bank, 2026). Residency here depends on where a person lives, rather than on their nationality, so the allowance also applies to migrant workers who have settled in South Africa (Webber Wentzel, n.d.). It is less clear whether these limits apply to crypto assets, since South African courts have reached conflicting decisions and new regulations covering crypto are still in draft (National Treasury, 2026). The platform therefore treats RLUSD transfers like any other transfer and applies the same limits.</w:t>
+        <w:t>The second concerns moving money across the border, which the South African Reserve Bank regulates. Wise, for instance, was only able to start serving South African customers after the Reserve Bank conditionally approved it as an Authorised Dealer in Foreign Exchange with Limited Authority (Wise, 2025). The platform needs the same kind of licence, or a partnership with a dealer that already holds one. Holding that authorisation also means enforcing the Reserve Bank's limits on how much customers may send abroad. Each resident can currently send up to R2 million a year without special approval (South African Reserve Bank, 2026). Residency here depends on where a person lives, rather than on their nationality, so the allowance also applies to migrant workers who have settled in South Africa (Webber Wentzel, n.d.). It is less clear whether these limits apply to crypto assets, since South African courts have reached conflicting decisions and new regulations covering crypto are still in draft (National Treasury, 2026). A live authorised dealer would have to apply the Reserve Bank’s annual discretionary allowance (currently R2 million); this prototype does not. It only enforces configurable daily and monthly ZAR caps, defaulting to R3,000 and R25,000 for verified senders.</w:t>
       </w:r>
     </w:p>
     <w:p>
@@ -1961,7 +1961,7 @@
           <w:szCs w:val="22"/>
           <w:lang w:val="en-US"/>
         </w:rPr>
-        <w:t>The platform applies this first to price. Senders see every fee, the exchange rate and the exact amount their recipient will receive before they confirm a transfer, rather than discovering part of the cost later in the rate.</w:t>
+        <w:t>The platform applies this first to price. Senders see every fee, the exchange rate and an estimate of the cash-out payout before they confirm a transfer. That payout is recalculated when the recipient cashes out, rather than the sender discovering part of the send-side cost later in the rate.</w:t>
       </w:r>
       <w:r>
         <w:br/>
@@ -2031,7 +2031,7 @@
           <w:szCs w:val="22"/>
           <w:lang w:val="en-US"/>
         </w:rPr>
-        <w:t>Because the platform holds customers' RLUSD and the private keys that control it, it carries responsibility for keeping those assets safe. Customer balances are recorded separately from the platform's own funds, so that each customer's holding can be identified at any time and is never mixed with the money the business uses to operate. The private keys receive the same care. They are stored in encrypted form, the key needed to decrypt them is kept separately, and only the part of the system that signs transactions can decrypt them.</w:t>
+        <w:t>Because the platform holds customers' RLUSD and the private keys that control it, it carries responsibility for keeping those assets safe. Each recipient’s spendable balance is an internal ledger. One platform treasury pays tokens into that recipient’s custodial account, whose key the platform holds. Those balances are not a separate bank account kept apart from the business’s operating money, and cash-in and fiat payout are simulated. The private keys receive the same care. They are stored encrypted with a Fernet key read from the environment, not from the database. Loading the wallet row decrypts the secret, and cash-out and settlement pass that plaintext into the payment helper. Wallet responses do not include the secret.</w:t>
       </w:r>
     </w:p>
     <w:p>
@@ -4251,35 +4251,11 @@
           <w:p>
             <w:r>
               <w:rPr>
-                <w:rFonts w:ascii="Consolas" w:eastAsia="Consolas" w:hAnsi="Consolas" w:cs="Consolas"/>
-                <w:sz w:val="17"/>
+                <w:rFonts w:ascii="Calibri" w:eastAsia="Consolas" w:hAnsi="Calibri" w:cs="Calibri"/>
+                <w:sz w:val="19"/>
                 <w:szCs w:val="17"/>
               </w:rPr>
-              <w:t>POST /kyc</w:t>
-            </w:r>
-            <w:r>
-              <w:rPr>
-                <w:rFonts w:ascii="Calibri" w:eastAsia="Calibri" w:hAnsi="Calibri" w:cs="Calibri"/>
-                <w:sz w:val="19"/>
-                <w:szCs w:val="19"/>
-              </w:rPr>
-              <w:t xml:space="preserve"> sets status </w:t>
-            </w:r>
-            <w:r>
-              <w:rPr>
-                <w:rFonts w:ascii="Consolas" w:eastAsia="Consolas" w:hAnsi="Consolas" w:cs="Consolas"/>
-                <w:sz w:val="17"/>
-                <w:szCs w:val="17"/>
-              </w:rPr>
-              <w:t>pending</w:t>
-            </w:r>
-            <w:r>
-              <w:rPr>
-                <w:rFonts w:ascii="Calibri" w:eastAsia="Calibri" w:hAnsi="Calibri" w:cs="Calibri"/>
-                <w:sz w:val="19"/>
-                <w:szCs w:val="19"/>
-              </w:rPr>
-              <w:t>; resubmission overwrites the application until it is approved.</w:t>
+              <w:t>POST /kyc sets status pending. The API overwrites a pending or rejected application and returns 409 once it is approved. The UI locks the form while it is pending; only a rejected application can be edited and resubmitted there.</w:t>
             </w:r>
           </w:p>
         </w:tc>
@@ -4503,35 +4479,11 @@
           <w:p>
             <w:r>
               <w:rPr>
-                <w:rFonts w:ascii="Consolas" w:eastAsia="Consolas" w:hAnsi="Consolas" w:cs="Consolas"/>
-                <w:sz w:val="17"/>
+                <w:rFonts w:ascii="Calibri" w:eastAsia="Consolas" w:hAnsi="Calibri" w:cs="Calibri"/>
+                <w:sz w:val="19"/>
                 <w:szCs w:val="17"/>
               </w:rPr>
-              <w:t>POST /kyc/{id}/approve</w:t>
-            </w:r>
-            <w:r>
-              <w:rPr>
-                <w:rFonts w:ascii="Calibri" w:eastAsia="Calibri" w:hAnsi="Calibri" w:cs="Calibri"/>
-                <w:sz w:val="19"/>
-                <w:szCs w:val="19"/>
-              </w:rPr>
-              <w:t xml:space="preserve"> or </w:t>
-            </w:r>
-            <w:r>
-              <w:rPr>
-                <w:rFonts w:ascii="Consolas" w:eastAsia="Consolas" w:hAnsi="Consolas" w:cs="Consolas"/>
-                <w:sz w:val="17"/>
-                <w:szCs w:val="17"/>
-              </w:rPr>
-              <w:t>/reject</w:t>
-            </w:r>
-            <w:r>
-              <w:rPr>
-                <w:rFonts w:ascii="Calibri" w:eastAsia="Calibri" w:hAnsi="Calibri" w:cs="Calibri"/>
-                <w:sz w:val="19"/>
-                <w:szCs w:val="19"/>
-              </w:rPr>
-              <w:t xml:space="preserve"> (with a reason); the UI confirms the decision in a dialog naming the applicant.</w:t>
+              <w:t>POST /kyc/{id}/approve or /reject. Reject requires a non-empty reason: the API returns 422 if it is missing or blank, and the admin UI asks for one before sending. The UI confirms the decision in a dialog naming the applicant.</w:t>
             </w:r>
           </w:p>
         </w:tc>
@@ -4739,19 +4691,11 @@
           <w:p>
             <w:r>
               <w:rPr>
-                <w:rFonts w:ascii="Consolas" w:eastAsia="Consolas" w:hAnsi="Consolas" w:cs="Consolas"/>
-                <w:sz w:val="17"/>
+                <w:rFonts w:ascii="Calibri" w:eastAsia="Consolas" w:hAnsi="Calibri" w:cs="Calibri"/>
+                <w:sz w:val="19"/>
                 <w:szCs w:val="17"/>
               </w:rPr>
-              <w:t>POST /remittances</w:t>
-            </w:r>
-            <w:r>
-              <w:rPr>
-                <w:rFonts w:ascii="Calibri" w:eastAsia="Calibri" w:hAnsi="Calibri" w:cs="Calibri"/>
-                <w:sz w:val="19"/>
-                <w:szCs w:val="19"/>
-              </w:rPr>
-              <w:t xml:space="preserve"> requires approved KYC; the UI shows “KYC pending” instead of the send form.</w:t>
+              <w:t>POST /remittances requires approved KYC and returns 403 otherwise. The send screen heading is “KYC not approved”, with a line for pending, rejected, or not submitted.</w:t>
             </w:r>
           </w:p>
         </w:tc>
@@ -5121,35 +5065,11 @@
           <w:p>
             <w:r>
               <w:rPr>
-                <w:rFonts w:ascii="Consolas" w:eastAsia="Consolas" w:hAnsi="Consolas" w:cs="Consolas"/>
-                <w:sz w:val="17"/>
+                <w:rFonts w:ascii="Calibri" w:eastAsia="Consolas" w:hAnsi="Calibri" w:cs="Calibri"/>
+                <w:sz w:val="19"/>
                 <w:szCs w:val="17"/>
               </w:rPr>
-              <w:t>POST /beneficiaries</w:t>
-            </w:r>
-            <w:r>
-              <w:rPr>
-                <w:rFonts w:ascii="Calibri" w:eastAsia="Calibri" w:hAnsi="Calibri" w:cs="Calibri"/>
-                <w:sz w:val="19"/>
-                <w:szCs w:val="19"/>
-              </w:rPr>
-              <w:t xml:space="preserve">, approved senders only; all five fields stored. UI </w:t>
-            </w:r>
-            <w:r>
-              <w:rPr>
-                <w:rFonts w:ascii="Consolas" w:eastAsia="Consolas" w:hAnsi="Consolas" w:cs="Consolas"/>
-                <w:sz w:val="17"/>
-                <w:szCs w:val="17"/>
-              </w:rPr>
-              <w:t>/app/beneficiaries</w:t>
-            </w:r>
-            <w:r>
-              <w:rPr>
-                <w:rFonts w:ascii="Calibri" w:eastAsia="Calibri" w:hAnsi="Calibri" w:cs="Calibri"/>
-                <w:sz w:val="19"/>
-                <w:szCs w:val="19"/>
-              </w:rPr>
-              <w:t>.</w:t>
+              <w:t>POST /beneficiaries, approved senders only; all five fields stored. UI /app/beneficiaries. payout_currency is stored and shown, but quotes do not use it.</w:t>
             </w:r>
           </w:p>
         </w:tc>
@@ -5440,23 +5360,7 @@
                 <w:sz w:val="19"/>
                 <w:szCs w:val="19"/>
               </w:rPr>
-              <w:t>Auto-match when the beneficiary is added, and again whenever a new account registers (</w:t>
-            </w:r>
-            <w:r>
-              <w:rPr>
-                <w:rFonts w:ascii="Consolas" w:eastAsia="Consolas" w:hAnsi="Consolas" w:cs="Consolas"/>
-                <w:sz w:val="17"/>
-                <w:szCs w:val="17"/>
-              </w:rPr>
-              <w:t>services/beneficiary_linking.py</w:t>
-            </w:r>
-            <w:r>
-              <w:rPr>
-                <w:rFonts w:ascii="Calibri" w:eastAsia="Calibri" w:hAnsi="Calibri" w:cs="Calibri"/>
-                <w:sz w:val="19"/>
-                <w:szCs w:val="19"/>
-              </w:rPr>
-              <w:t>).</w:t>
+              <w:t>Match is mobile number or email, and either one is enough. The first matching account wins. Linking runs when the beneficiary is added and again when a new account registers. PATCH /users/me does not relink. Email matching is case-insensitive; account email uniqueness is case-sensitive.</w:t>
             </w:r>
           </w:p>
         </w:tc>
@@ -5523,7 +5427,7 @@
                 <w:sz w:val="19"/>
                 <w:szCs w:val="19"/>
               </w:rPr>
-              <w:t>If no account matches, leave the beneficiary unlinked; no wallet and no settlement until a matching account registers.</w:t>
+              <w:t>Provision a custodial wallet only once the beneficiary is linked to a registered recipient account.</w:t>
             </w:r>
           </w:p>
         </w:tc>
@@ -5550,23 +5454,7 @@
                 <w:sz w:val="19"/>
                 <w:szCs w:val="19"/>
               </w:rPr>
-              <w:t xml:space="preserve">The record stays unlinked. If cash-in is confirmed anyway, the worker refuses to settle (“Beneficiary is not linked to a registered recipient account”), creates no wallet, credits nothing, and marks the transfer </w:t>
-            </w:r>
-            <w:r>
-              <w:rPr>
-                <w:rFonts w:ascii="Consolas" w:eastAsia="Consolas" w:hAnsi="Consolas" w:cs="Consolas"/>
-                <w:sz w:val="17"/>
-                <w:szCs w:val="17"/>
-              </w:rPr>
-              <w:t>settlement_failed</w:t>
-            </w:r>
-            <w:r>
-              <w:rPr>
-                <w:rFonts w:ascii="Calibri" w:eastAsia="Calibri" w:hAnsi="Calibri" w:cs="Calibri"/>
-                <w:sz w:val="19"/>
-                <w:szCs w:val="19"/>
-              </w:rPr>
-              <w:t>; an administrator retries once the recipient registers and is linked.</w:t>
+              <w:t>A wallet row is created when the beneficiary is linked. The XRP Ledger Testnet account is created at the first settlement, and only for that linked user.</w:t>
             </w:r>
           </w:p>
         </w:tc>
@@ -5633,7 +5521,7 @@
                 <w:sz w:val="19"/>
                 <w:szCs w:val="19"/>
               </w:rPr>
-              <w:t>Provision a custodial wallet only once the beneficiary is linked to a registered recipient account.</w:t>
+              <w:t>If no account matches, leave the beneficiary unlinked; no wallet and no settlement until a matching account registers.</w:t>
             </w:r>
           </w:p>
         </w:tc>
@@ -5660,7 +5548,7 @@
                 <w:sz w:val="19"/>
                 <w:szCs w:val="19"/>
               </w:rPr>
-              <w:t>The recipient’s custodial Testnet account is created at first settlement, and only for the linked user.</w:t>
+              <w:t>The record stays unlinked. If cash-in is confirmed anyway, the worker refuses to settle (“Beneficiary is not linked to a registered recipient account”), creates no wallet, credits nothing, and marks the transfer settlement_failed; an administrator retries once the recipient registers and is linked.</w:t>
             </w:r>
           </w:p>
         </w:tc>
@@ -6510,7 +6398,7 @@
                 <w:sz w:val="19"/>
                 <w:szCs w:val="19"/>
               </w:rPr>
-              <w:t>Checked before the quote is inserted; cancelled and expired quotes do not count (Section 6).</w:t>
+              <w:t>Checked on gross zar_amount before the quote is inserted. Refused only when usage plus the amount is strictly greater than the cap. Cancelled and expired quotes do not count. Two quotes sent together are not row-locked, so they can both pass.</w:t>
             </w:r>
           </w:p>
         </w:tc>
@@ -7217,7 +7105,7 @@
                 <w:sz w:val="19"/>
                 <w:szCs w:val="19"/>
               </w:rPr>
-              <w:t>Administrator or mock service confirms the payment.</w:t>
+              <w:t>Administrator confirms the payment.</w:t>
             </w:r>
           </w:p>
         </w:tc>
@@ -7240,35 +7128,11 @@
           <w:p>
             <w:r>
               <w:rPr>
-                <w:rFonts w:ascii="Consolas" w:eastAsia="Consolas" w:hAnsi="Consolas" w:cs="Consolas"/>
-                <w:sz w:val="17"/>
+                <w:rFonts w:ascii="Calibri" w:eastAsia="Consolas" w:hAnsi="Calibri" w:cs="Calibri"/>
+                <w:sz w:val="19"/>
                 <w:szCs w:val="17"/>
               </w:rPr>
-              <w:t>POST /remittances/{id}/confirm-cash-in</w:t>
-            </w:r>
-            <w:r>
-              <w:rPr>
-                <w:rFonts w:ascii="Calibri" w:eastAsia="Calibri" w:hAnsi="Calibri" w:cs="Calibri"/>
-                <w:sz w:val="19"/>
-                <w:szCs w:val="19"/>
-              </w:rPr>
-              <w:t xml:space="preserve">; UI </w:t>
-            </w:r>
-            <w:r>
-              <w:rPr>
-                <w:rFonts w:ascii="Consolas" w:eastAsia="Consolas" w:hAnsi="Consolas" w:cs="Consolas"/>
-                <w:sz w:val="17"/>
-                <w:szCs w:val="17"/>
-              </w:rPr>
-              <w:t>/admin/cash-in</w:t>
-            </w:r>
-            <w:r>
-              <w:rPr>
-                <w:rFonts w:ascii="Calibri" w:eastAsia="Calibri" w:hAnsi="Calibri" w:cs="Calibri"/>
-                <w:sz w:val="19"/>
-                <w:szCs w:val="19"/>
-              </w:rPr>
-              <w:t>.</w:t>
+              <w:t>POST /remittances/{id}/confirm-cash-in; UI /admin/cash-in. There is no mock payment-provider route.</w:t>
             </w:r>
           </w:p>
         </w:tc>
@@ -7727,35 +7591,11 @@
           <w:p>
             <w:r>
               <w:rPr>
-                <w:rFonts w:ascii="Consolas" w:eastAsia="Consolas" w:hAnsi="Consolas" w:cs="Consolas"/>
-                <w:sz w:val="17"/>
+                <w:rFonts w:ascii="Calibri" w:eastAsia="Consolas" w:hAnsi="Calibri" w:cs="Calibri"/>
+                <w:sz w:val="19"/>
                 <w:szCs w:val="17"/>
               </w:rPr>
-              <w:t>scripts/run_settlement_worker.py</w:t>
-            </w:r>
-            <w:r>
-              <w:rPr>
-                <w:rFonts w:ascii="Calibri" w:eastAsia="Calibri" w:hAnsi="Calibri" w:cs="Calibri"/>
-                <w:sz w:val="19"/>
-                <w:szCs w:val="19"/>
-              </w:rPr>
-              <w:t xml:space="preserve"> or </w:t>
-            </w:r>
-            <w:r>
-              <w:rPr>
-                <w:rFonts w:ascii="Consolas" w:eastAsia="Consolas" w:hAnsi="Consolas" w:cs="Consolas"/>
-                <w:sz w:val="17"/>
-                <w:szCs w:val="17"/>
-              </w:rPr>
-              <w:t>POST /admin/settlement/run</w:t>
-            </w:r>
-            <w:r>
-              <w:rPr>
-                <w:rFonts w:ascii="Calibri" w:eastAsia="Calibri" w:hAnsi="Calibri" w:cs="Calibri"/>
-                <w:sz w:val="19"/>
-                <w:szCs w:val="19"/>
-              </w:rPr>
-              <w:t xml:space="preserve"> reads the stream as a consumer group and submits a UCTUSD Payment with xrpl-py.</w:t>
+              <w:t>scripts/run_settlement_worker.py or POST /admin/settlement/run drains the stream once, reclaiming idle entries and then reading new ones, and submits a UCTUSD Payment with xrpl-py. It is not a process that stays running between calls.</w:t>
             </w:r>
           </w:p>
         </w:tc>
@@ -8101,7 +7941,7 @@
                 <w:sz w:val="19"/>
                 <w:szCs w:val="19"/>
               </w:rPr>
-              <w:t>One message per remittance (unique constraint); if a hash is already stored the worker marks the job complete without paying or crediting; retrying a completed message returns 409.</w:t>
+              <w:t>One message per remittance (unique constraint). If a hash is already stored the worker marks the job complete without paying or crediting, and retrying a completed message returns 409. A crash after the ledger has accepted the Payment and before that hash is stored can submit a second Payment.</w:t>
             </w:r>
           </w:p>
         </w:tc>
@@ -8195,23 +8035,7 @@
                 <w:sz w:val="19"/>
                 <w:szCs w:val="19"/>
               </w:rPr>
-              <w:t xml:space="preserve">The worker waits for ledger validation, then stores the hash, credits the balance, and sets </w:t>
-            </w:r>
-            <w:r>
-              <w:rPr>
-                <w:rFonts w:ascii="Consolas" w:eastAsia="Consolas" w:hAnsi="Consolas" w:cs="Consolas"/>
-                <w:sz w:val="17"/>
-                <w:szCs w:val="17"/>
-              </w:rPr>
-              <w:t>settled</w:t>
-            </w:r>
-            <w:r>
-              <w:rPr>
-                <w:rFonts w:ascii="Calibri" w:eastAsia="Calibri" w:hAnsi="Calibri" w:cs="Calibri"/>
-                <w:sz w:val="19"/>
-                <w:szCs w:val="19"/>
-              </w:rPr>
-              <w:t xml:space="preserve"> in one database commit.</w:t>
+              <w:t>After the ledger validates the Payment, one database commit stores the hash, credits the balance, and sets settled. A crash between validation and that commit leaves no hash, so the guard in FR-25 has not started yet.</w:t>
             </w:r>
           </w:p>
         </w:tc>
@@ -8613,7 +8437,7 @@
                 <w:sz w:val="19"/>
                 <w:szCs w:val="19"/>
               </w:rPr>
-              <w:t>Spendable and on-chain balances; incoming transfers with amount, status, dates, and hash; cash-outs with amount, currency, status, dates, and burn hash.</w:t>
+              <w:t>Spendable balance, and an on-chain figure that is spendable plus requested or approved cash-out amounts, not a live read of the trust line. Incoming transfers show amount, status, dates, and hash. Cash-outs show amount, currency, status, dates, and burn hash.</w:t>
             </w:r>
           </w:p>
         </w:tc>
@@ -9337,99 +9161,11 @@
           <w:p>
             <w:r>
               <w:rPr>
-                <w:rFonts w:ascii="Consolas" w:eastAsia="Consolas" w:hAnsi="Consolas" w:cs="Consolas"/>
-                <w:sz w:val="17"/>
+                <w:rFonts w:ascii="Calibri" w:eastAsia="Consolas" w:hAnsi="Calibri" w:cs="Calibri"/>
+                <w:sz w:val="19"/>
                 <w:szCs w:val="17"/>
               </w:rPr>
-              <w:t>requested</w:t>
-            </w:r>
-            <w:r>
-              <w:rPr>
-                <w:rFonts w:ascii="Calibri" w:eastAsia="Calibri" w:hAnsi="Calibri" w:cs="Calibri"/>
-                <w:sz w:val="19"/>
-                <w:szCs w:val="19"/>
-              </w:rPr>
-              <w:t xml:space="preserve"> → </w:t>
-            </w:r>
-            <w:r>
-              <w:rPr>
-                <w:rFonts w:ascii="Consolas" w:eastAsia="Consolas" w:hAnsi="Consolas" w:cs="Consolas"/>
-                <w:sz w:val="17"/>
-                <w:szCs w:val="17"/>
-              </w:rPr>
-              <w:t>approved</w:t>
-            </w:r>
-            <w:r>
-              <w:rPr>
-                <w:rFonts w:ascii="Calibri" w:eastAsia="Calibri" w:hAnsi="Calibri" w:cs="Calibri"/>
-                <w:sz w:val="19"/>
-                <w:szCs w:val="19"/>
-              </w:rPr>
-              <w:t xml:space="preserve"> → </w:t>
-            </w:r>
-            <w:r>
-              <w:rPr>
-                <w:rFonts w:ascii="Consolas" w:eastAsia="Consolas" w:hAnsi="Consolas" w:cs="Consolas"/>
-                <w:sz w:val="17"/>
-                <w:szCs w:val="17"/>
-              </w:rPr>
-              <w:t>completed</w:t>
-            </w:r>
-            <w:r>
-              <w:rPr>
-                <w:rFonts w:ascii="Calibri" w:eastAsia="Calibri" w:hAnsi="Calibri" w:cs="Calibri"/>
-                <w:sz w:val="19"/>
-                <w:szCs w:val="19"/>
-              </w:rPr>
-              <w:t xml:space="preserve">, or </w:t>
-            </w:r>
-            <w:r>
-              <w:rPr>
-                <w:rFonts w:ascii="Consolas" w:eastAsia="Consolas" w:hAnsi="Consolas" w:cs="Consolas"/>
-                <w:sz w:val="17"/>
-                <w:szCs w:val="17"/>
-              </w:rPr>
-              <w:t>failed</w:t>
-            </w:r>
-            <w:r>
-              <w:rPr>
-                <w:rFonts w:ascii="Calibri" w:eastAsia="Calibri" w:hAnsi="Calibri" w:cs="Calibri"/>
-                <w:sz w:val="19"/>
-                <w:szCs w:val="19"/>
-              </w:rPr>
-              <w:t xml:space="preserve"> from </w:t>
-            </w:r>
-            <w:r>
-              <w:rPr>
-                <w:rFonts w:ascii="Consolas" w:eastAsia="Consolas" w:hAnsi="Consolas" w:cs="Consolas"/>
-                <w:sz w:val="17"/>
-                <w:szCs w:val="17"/>
-              </w:rPr>
-              <w:t>requested</w:t>
-            </w:r>
-            <w:r>
-              <w:rPr>
-                <w:rFonts w:ascii="Calibri" w:eastAsia="Calibri" w:hAnsi="Calibri" w:cs="Calibri"/>
-                <w:sz w:val="19"/>
-                <w:szCs w:val="19"/>
-              </w:rPr>
-              <w:t xml:space="preserve"> or </w:t>
-            </w:r>
-            <w:r>
-              <w:rPr>
-                <w:rFonts w:ascii="Consolas" w:eastAsia="Consolas" w:hAnsi="Consolas" w:cs="Consolas"/>
-                <w:sz w:val="17"/>
-                <w:szCs w:val="17"/>
-              </w:rPr>
-              <w:t>approved</w:t>
-            </w:r>
-            <w:r>
-              <w:rPr>
-                <w:rFonts w:ascii="Calibri" w:eastAsia="Calibri" w:hAnsi="Calibri" w:cs="Calibri"/>
-                <w:sz w:val="19"/>
-                <w:szCs w:val="19"/>
-              </w:rPr>
-              <w:t>. Complete burns the reserved UCTUSD by paying the issuer; fail refunds the spendable balance.</w:t>
+              <w:t>requested → approved → completed, or failed from requested or approved. Complete burns the gross reserved UCTUSD (the full rlusd_amount) by paying the issuer. The fiat payout stored on the row is the net after the cash-out fee and is not paid by a bank. Fail refunds that gross amount to the cash-out user’s spendable balance.</w:t>
             </w:r>
           </w:p>
         </w:tc>
@@ -9911,71 +9647,7 @@
                 <w:sz w:val="19"/>
                 <w:szCs w:val="19"/>
               </w:rPr>
-              <w:t xml:space="preserve">UI </w:t>
-            </w:r>
-            <w:r>
-              <w:rPr>
-                <w:rFonts w:ascii="Consolas" w:eastAsia="Consolas" w:hAnsi="Consolas" w:cs="Consolas"/>
-                <w:sz w:val="17"/>
-                <w:szCs w:val="17"/>
-              </w:rPr>
-              <w:t>/admin/cash-out</w:t>
-            </w:r>
-            <w:r>
-              <w:rPr>
-                <w:rFonts w:ascii="Calibri" w:eastAsia="Calibri" w:hAnsi="Calibri" w:cs="Calibri"/>
-                <w:sz w:val="19"/>
-                <w:szCs w:val="19"/>
-              </w:rPr>
-              <w:t xml:space="preserve">: </w:t>
-            </w:r>
-            <w:r>
-              <w:rPr>
-                <w:rFonts w:ascii="Consolas" w:eastAsia="Consolas" w:hAnsi="Consolas" w:cs="Consolas"/>
-                <w:sz w:val="17"/>
-                <w:szCs w:val="17"/>
-              </w:rPr>
-              <w:t>POST /cash-outs/{id}/approve</w:t>
-            </w:r>
-            <w:r>
-              <w:rPr>
-                <w:rFonts w:ascii="Calibri" w:eastAsia="Calibri" w:hAnsi="Calibri" w:cs="Calibri"/>
-                <w:sz w:val="19"/>
-                <w:szCs w:val="19"/>
-              </w:rPr>
-              <w:t xml:space="preserve">, </w:t>
-            </w:r>
-            <w:r>
-              <w:rPr>
-                <w:rFonts w:ascii="Consolas" w:eastAsia="Consolas" w:hAnsi="Consolas" w:cs="Consolas"/>
-                <w:sz w:val="17"/>
-                <w:szCs w:val="17"/>
-              </w:rPr>
-              <w:t>/complete</w:t>
-            </w:r>
-            <w:r>
-              <w:rPr>
-                <w:rFonts w:ascii="Calibri" w:eastAsia="Calibri" w:hAnsi="Calibri" w:cs="Calibri"/>
-                <w:sz w:val="19"/>
-                <w:szCs w:val="19"/>
-              </w:rPr>
-              <w:t xml:space="preserve">, </w:t>
-            </w:r>
-            <w:r>
-              <w:rPr>
-                <w:rFonts w:ascii="Consolas" w:eastAsia="Consolas" w:hAnsi="Consolas" w:cs="Consolas"/>
-                <w:sz w:val="17"/>
-                <w:szCs w:val="17"/>
-              </w:rPr>
-              <w:t>/fail</w:t>
-            </w:r>
-            <w:r>
-              <w:rPr>
-                <w:rFonts w:ascii="Calibri" w:eastAsia="Calibri" w:hAnsi="Calibri" w:cs="Calibri"/>
-                <w:sz w:val="19"/>
-                <w:szCs w:val="19"/>
-              </w:rPr>
-              <w:t>.</w:t>
+              <w:t>UI /admin/cash-out: POST /cash-outs/{id}/approve, /complete, /fail. Fail refunds the cash-out user (the recipient), not the remittance sender.</w:t>
             </w:r>
           </w:p>
         </w:tc>
@@ -11040,7 +10712,7 @@
           <w:sz w:val="20"/>
           <w:szCs w:val="20"/>
         </w:rPr>
-        <w:t>worth exactly one US dollar. Fees are rounded to the nearest cent and token amounts to six decimal places, with halves rounded up. If the fee is as large as the amount sent</w:t>
+        <w:t>worth exactly one US dollar. The ZAR transaction fee and the fiat payout are rounded to two decimal places, and the cash-out fee and token amounts to six decimal places, with halves rounded up. At the fallback rate of 18.50 and the default fees, a R1,000 send has a transaction fee of R35.00, an effective rate of 18.87, a net of R965.00, 51.139375 UCTUSD, an estimated cash-out fee of 0.767091 tokens and an estimated payout of 50.372284 tokens, not rand. If the fee is as large as the amount sent</w:t>
       </w:r>
       <w:r>
         <w:rPr>
@@ -12401,7 +12073,7 @@
           <w:sz w:val="19"/>
           <w:szCs w:val="19"/>
         </w:rPr>
-        <w:t>Remittance limits depend on whether is verified or</w:t>
+        <w:t>Remittance limits depend on whether the sender is verified or unverified. Table 10 shows the default tiers:</w:t>
       </w:r>
       <w:r>
         <w:rPr>
@@ -12409,7 +12081,6 @@
           <w:sz w:val="19"/>
           <w:szCs w:val="19"/>
         </w:rPr>
-        <w:t xml:space="preserve"> unverified</w:t>
       </w:r>
       <w:r>
         <w:rPr>
@@ -12417,7 +12088,6 @@
           <w:sz w:val="19"/>
           <w:szCs w:val="19"/>
         </w:rPr>
-        <w:t>:</w:t>
       </w:r>
     </w:p>
     <w:tbl>
@@ -12479,7 +12149,7 @@
                 <w:sz w:val="19"/>
                 <w:szCs w:val="19"/>
               </w:rPr>
-              <w:t>Status</w:t>
+              <w:t>Tier</w:t>
             </w:r>
           </w:p>
         </w:tc>
@@ -12533,7 +12203,7 @@
                 <w:sz w:val="19"/>
                 <w:szCs w:val="19"/>
               </w:rPr>
-              <w:t>Montly limit</w:t>
+              <w:t>Monthly limit</w:t>
             </w:r>
           </w:p>
         </w:tc>
@@ -12789,7 +12459,7 @@
           <w:sz w:val="19"/>
           <w:szCs w:val="19"/>
         </w:rPr>
-        <w:t xml:space="preserve">, the </w:t>
+        <w:t>. The R0 caps are the configured unverified tier and are shown on GET /limits/me. Sending is blocked earlier: POST /remittances returns 403 until KYC is approved, so an unverified sender does not reach the R0 check.</w:t>
       </w:r>
       <w:r>
         <w:rPr>
@@ -12797,7 +12467,6 @@
           <w:sz w:val="19"/>
           <w:szCs w:val="19"/>
         </w:rPr>
-        <w:t xml:space="preserve">zero </w:t>
       </w:r>
       <w:r>
         <w:rPr>
@@ -12805,7 +12474,6 @@
           <w:sz w:val="19"/>
           <w:szCs w:val="19"/>
         </w:rPr>
-        <w:t>limits</w:t>
       </w:r>
       <w:r>
         <w:rPr>
@@ -12813,7 +12481,6 @@
           <w:sz w:val="19"/>
           <w:szCs w:val="19"/>
         </w:rPr>
-        <w:t xml:space="preserve"> </w:t>
       </w:r>
       <w:r>
         <w:rPr>
@@ -12821,7 +12488,6 @@
           <w:sz w:val="19"/>
           <w:szCs w:val="19"/>
         </w:rPr>
-        <w:t>exist such that unverified users cannot send remittances.</w:t>
       </w:r>
     </w:p>
     <w:p>
@@ -12839,7 +12505,7 @@
           <w:sz w:val="19"/>
           <w:szCs w:val="19"/>
         </w:rPr>
-        <w:t>Usage sums the sender’s ZAR since the start of the UTC day or calendar month, with two exclu</w:t>
+        <w:t>Usage sums the sender’s gross zar_amount since the start of the UTC day or calendar month. A new quote is refused only when that usage plus the new amount is strictly greater than the cap, so a send that lands exactly on the cap is allowed. Two exclusions apply:</w:t>
       </w:r>
       <w:r>
         <w:rPr>
@@ -12847,7 +12513,6 @@
           <w:sz w:val="19"/>
           <w:szCs w:val="19"/>
         </w:rPr>
-        <w:t>sions:</w:t>
       </w:r>
     </w:p>
     <w:p>
@@ -12971,7 +12636,7 @@
           <w:sz w:val="19"/>
           <w:szCs w:val="19"/>
         </w:rPr>
-        <w:t>. This is because a failed on-chain payment still follows a confirmed cash-in, so the sender’s rand was received, and the amount stays counted. An administrator can retry the settlement, but nothing releases the amount early. Thus, the usage sum only stops counting when the day or month ends.</w:t>
+        <w:t>. This is because a failed on-chain payment still follows a confirmed cash-in, so the sender’s rand was received, and the amount stays counted. An administrator can retry a failed settlement, and that does not release the amount. Cancelling a quote, or letting it expire, does release it before the period ends. What is still counted drops out of the sum only when the UTC day or month rolls over.</w:t>
       </w:r>
     </w:p>
     <w:p>
@@ -13346,7 +13011,7 @@
                 <w:sz w:val="19"/>
                 <w:szCs w:val="19"/>
               </w:rPr>
-              <w:t xml:space="preserve"> (past TTL)</w:t>
+              <w:t>, after expiry</w:t>
             </w:r>
           </w:p>
         </w:tc>
@@ -13373,7 +13038,7 @@
                 <w:sz w:val="19"/>
                 <w:szCs w:val="19"/>
               </w:rPr>
-              <w:t>Clock runs out; cash-in returns 409</w:t>
+              <w:t>The stored status stays quoted. Once expires_at has passed, cash-in returns 409 and the amount no longer counts</w:t>
             </w:r>
           </w:p>
         </w:tc>
@@ -14585,7 +14250,7 @@
           <w:rFonts w:ascii="Segoe UI" w:hAnsi="Segoe UI"/>
           <w:sz w:val="20"/>
         </w:rPr>
-        <w:t>Two separate encryption keys are read from the environment, not from the database. One encrypts the KYC identification number. The other encrypts the platform and recipient XRP Ledger secrets. A leak of one key does not decrypt the other. Wallet and platform-wallet responses include addresses and balances and do not include secrets. Secrets are decrypted only in the code that signs a TrustSet or a Payment. The identification number is decrypted when a KYC record is read, so the applicant and an administrator reviewing the application can see it.</w:t>
+        <w:t>Two separate encryption keys are read from the environment, not from the database. One encrypts the KYC identification number. The other encrypts the platform and recipient XRP Ledger secrets. A leak of one key does not decrypt the other. Wallet and platform-wallet responses include addresses and balances and do not include secrets. SQLAlchemy decrypts a secret whenever the wallet row is loaded. Cash-out completion and settlement then pass that plaintext into the payment helper. The identification number is decrypted when a KYC record is read, so the applicant and an administrator reviewing the application can see it.</w:t>
       </w:r>
     </w:p>
     <w:p>

</xml_diff>

<commit_message>
Stop a retry from paying twice, and decrypt wallet secrets only when signing.
Before a Payment is submitted, the worker adopts an existing validated transaction with that remittance memo. Wallet secrets load as ciphertext. The specification and the enqueue log match that behaviour.

Co-authored-by: UCT Karabo Tigedi <Karabo22Tigedi@users.noreply.github.com>
</commit_message>
<xml_diff>
--- a/ECO5040W_Business_And_Tech_Specification_kerrys.docx
+++ b/ECO5040W_Business_And_Tech_Specification_kerrys.docx
@@ -2031,7 +2031,7 @@
           <w:szCs w:val="22"/>
           <w:lang w:val="en-US"/>
         </w:rPr>
-        <w:t>Because the platform holds customers' RLUSD and the private keys that control it, it carries responsibility for keeping those assets safe. Each recipient’s spendable balance is an internal ledger. One platform treasury pays tokens into that recipient’s custodial account, whose key the platform holds. Those balances are not a separate bank account kept apart from the business’s operating money, and cash-in and fiat payout are simulated. The private keys receive the same care. They are stored encrypted with a Fernet key read from the environment, not from the database. Loading the wallet row decrypts the secret, and cash-out and settlement pass that plaintext into the payment helper. Wallet responses do not include the secret.</w:t>
+        <w:t>Because the platform holds customers' RLUSD and the private keys that control it, it carries responsibility for keeping those assets safe. Each recipient’s spendable balance is an internal ledger. One platform treasury pays tokens into that recipient’s custodial account, whose key the platform holds. Those balances are not a separate bank account kept apart from the business’s operating money, and cash-in and fiat payout are simulated. The private keys receive the same care. They are stored encrypted with a Fernet key read from the environment, not from the database. The row loads ciphertext and the seed is decrypted only when settlement, cash-out completion, or a TrustSet is about to sign. Wallet responses still omit the secret.</w:t>
       </w:r>
     </w:p>
     <w:p>
@@ -7941,7 +7941,7 @@
                 <w:sz w:val="19"/>
                 <w:szCs w:val="19"/>
               </w:rPr>
-              <w:t>One message per remittance (unique constraint). If a hash is already stored the worker marks the job complete without paying or crediting, and retrying a completed message returns 409. A crash after the ledger has accepted the Payment and before that hash is stored can submit a second Payment.</w:t>
+              <w:t>One message per remittance (unique constraint). If a hash is already stored the worker marks the job complete without paying or crediting, and retrying a completed message returns 409. Before submitting, the worker looks up a validated Payment on the sending account whose memo is this remittance id and adopts that hash instead of paying again; the wallet is still credited if this process had not credited it yet. Two overlapping worker runs can still both miss the lookup and pay twice.</w:t>
             </w:r>
           </w:p>
         </w:tc>
@@ -8035,7 +8035,7 @@
                 <w:sz w:val="19"/>
                 <w:szCs w:val="19"/>
               </w:rPr>
-              <w:t>After the ledger validates the Payment, one database commit stores the hash, credits the balance, and sets settled. A crash between validation and that commit leaves no hash, so the guard in FR-25 has not started yet.</w:t>
+              <w:t>After the ledger validates the Payment, one database commit stores the hash, credits the balance, and sets settled. A crash between validation and that commit leaves no hash. The next run looks the Payment up by its memo and adopts that hash instead of paying again, then credits the wallet.</w:t>
             </w:r>
           </w:p>
         </w:tc>
@@ -8539,7 +8539,7 @@
                 <w:sz w:val="19"/>
                 <w:szCs w:val="19"/>
               </w:rPr>
-              <w:t xml:space="preserve"> and </w:t>
+              <w:t xml:space="preserve"> lists amount, status, and tracking reference, and the quote breakdown, cash-in/settlement timeline, hash, and QR are on </w:t>
             </w:r>
             <w:r>
               <w:rPr>
@@ -8547,15 +8547,15 @@
                 <w:sz w:val="17"/>
                 <w:szCs w:val="17"/>
               </w:rPr>
-              <w:t>GET /remittances/track/{ref}</w:t>
-            </w:r>
-            <w:r>
-              <w:rPr>
-                <w:rFonts w:ascii="Calibri" w:eastAsia="Calibri" w:hAnsi="Calibri" w:cs="Calibri"/>
-                <w:sz w:val="19"/>
-                <w:szCs w:val="19"/>
-              </w:rPr>
-              <w:t xml:space="preserve">; UI </w:t>
+              <w:t>/app/track/{ref}</w:t>
+            </w:r>
+            <w:r>
+              <w:rPr>
+                <w:rFonts w:ascii="Calibri" w:eastAsia="Calibri" w:hAnsi="Calibri" w:cs="Calibri"/>
+                <w:sz w:val="19"/>
+                <w:szCs w:val="19"/>
+              </w:rPr>
+              <w:t xml:space="preserve"> and </w:t>
             </w:r>
             <w:r>
               <w:rPr>
@@ -8563,15 +8563,15 @@
                 <w:sz w:val="17"/>
                 <w:szCs w:val="17"/>
               </w:rPr>
-              <w:t>/app/history</w:t>
-            </w:r>
-            <w:r>
-              <w:rPr>
-                <w:rFonts w:ascii="Calibri" w:eastAsia="Calibri" w:hAnsi="Calibri" w:cs="Calibri"/>
-                <w:sz w:val="19"/>
-                <w:szCs w:val="19"/>
-              </w:rPr>
-              <w:t xml:space="preserve"> and </w:t>
+              <w:t>/app/send/{id}</w:t>
+            </w:r>
+            <w:r>
+              <w:rPr>
+                <w:rFonts w:ascii="Calibri" w:eastAsia="Calibri" w:hAnsi="Calibri" w:cs="Calibri"/>
+                <w:sz w:val="19"/>
+                <w:szCs w:val="19"/>
+              </w:rPr>
+              <w:t xml:space="preserve">, not on </w:t>
             </w:r>
             <w:r>
               <w:rPr>
@@ -8579,15 +8579,15 @@
                 <w:sz w:val="17"/>
                 <w:szCs w:val="17"/>
               </w:rPr>
-              <w:t>/app/track/{ref}</w:t>
-            </w:r>
-            <w:r>
-              <w:rPr>
-                <w:rFonts w:ascii="Calibri" w:eastAsia="Calibri" w:hAnsi="Calibri" w:cs="Calibri"/>
-                <w:sz w:val="19"/>
-                <w:szCs w:val="19"/>
-              </w:rPr>
-              <w:t xml:space="preserve"> show the quote breakdown, a status timeline, the hash, and a scannable QR code for the track page.</w:t>
+              <w:t>/app/history</w:t>
+            </w:r>
+            <w:r>
+              <w:rPr>
+                <w:rFonts w:ascii="Calibri" w:eastAsia="Calibri" w:hAnsi="Calibri" w:cs="Calibri"/>
+                <w:sz w:val="19"/>
+                <w:szCs w:val="19"/>
+              </w:rPr>
+              <w:t>.</w:t>
             </w:r>
           </w:p>
         </w:tc>
@@ -13679,7 +13679,7 @@
           <w:rFonts w:ascii="Segoe UI" w:hAnsi="Segoe UI"/>
           <w:sz w:val="20"/>
         </w:rPr>
-        <w:t>The running system is the web application, the JSON API, the database, Redis Streams, the settlement worker, and the XRP Ledger Testnet. Redis only carries the settlement instruction. The remittance row and the settlement message are the record. The treasury is one platform Testnet account. Each linked recipient receives their own custodial Testnet account on first settlement. Spendable balance is the internal ledger on the wallet row, not a live balance read from the recipient’s trust line.</w:t>
+        <w:t>The running system is the web application, the JSON API, the database, Redis Streams, the settlement worker, and the XRP Ledger Testnet. Redis only carries the settlement instruction. The remittance row and the settlement message are the record. The treasury is one platform Testnet account. Each linked recipient receives their own custodial Testnet account on first settlement. Spendable balance is the internal ledger on the wallet row, not a live balance read from the recipient’s trust line. The prototype uses both wallet options in the brief: a separate Testnet account for each linked recipient, and an internal ledger for the spendable balance. The on-chain figure is not a live trust-line balance.</w:t>
       </w:r>
     </w:p>
     <w:p>
@@ -13808,7 +13808,7 @@
           <w:rFonts w:ascii="Segoe UI" w:hAnsi="Segoe UI"/>
           <w:sz w:val="20"/>
         </w:rPr>
-        <w:t>On success the spendable balance is increased, the remittance is marked settled, and the transaction hash is stored, in one database commit. On failure the balance is not increased and the reason is stored on the message and the remittance. A message already completed, or a remittance that already has a hash, is not paid or credited again. An administrator can retry a pending, processing, or failed message by putting a new entry on the stream. A completed settlement cannot be retried. If the Payment has already succeeded and the process dies before the commit that stores the hash, a later pass will not see the hash and can submit a second Payment. Once the hash is stored, that does not happen.</w:t>
+        <w:t>On success the spendable balance is increased, the remittance is marked settled, and the transaction hash is stored, in one database commit. On failure the balance is not increased and the reason is stored on the message and the remittance. A message already completed, or a remittance that already has a hash, is not paid or credited again. An administrator can retry a pending, processing, or failed message by putting a new entry on the stream. A completed settlement cannot be retried. Before submitting, the worker looks up a validated Payment on the sending account whose memo is this remittance id and adopts that hash instead of paying again; the wallet is still credited if this process had not credited it yet. Two overlapping worker runs can still both miss the lookup and pay twice.</w:t>
       </w:r>
     </w:p>
     <w:p>
@@ -14250,7 +14250,7 @@
           <w:rFonts w:ascii="Segoe UI" w:hAnsi="Segoe UI"/>
           <w:sz w:val="20"/>
         </w:rPr>
-        <w:t>Two separate encryption keys are read from the environment, not from the database. One encrypts the KYC identification number. The other encrypts the platform and recipient XRP Ledger secrets. A leak of one key does not decrypt the other. Wallet and platform-wallet responses include addresses and balances and do not include secrets. SQLAlchemy decrypts a secret whenever the wallet row is loaded. Cash-out completion and settlement then pass that plaintext into the payment helper. The identification number is decrypted when a KYC record is read, so the applicant and an administrator reviewing the application can see it.</w:t>
+        <w:t>Two separate encryption keys are read from the environment, not from the database. One encrypts the KYC identification number. The other encrypts the platform and recipient XRP Ledger secrets. A leak of one key does not decrypt the other. Wallet and platform-wallet responses include addresses and balances and do not include secrets. The row loads ciphertext and the seed is decrypted only when settlement, cash-out completion, or a TrustSet is about to sign. The identification number is decrypted when a KYC record is read, so the applicant and an administrator reviewing the application can see it.</w:t>
       </w:r>
     </w:p>
     <w:p>
@@ -14361,7 +14361,7 @@
           <w:rFonts w:ascii="Segoe UI" w:hAnsi="Segoe UI"/>
           <w:sz w:val="20"/>
         </w:rPr>
-        <w:t>The daily and monthly check reads current usage and then inserts the quote. Nothing locks the sender’s rows between those two steps, so two quotes submitted together can both pass and together exceed the cap. Settlement will not pay twice once the transaction hash has been saved. A crash after the ledger has accepted the Payment and before that save can still submit it again. The automated tests replace the ledger calls, so they do not show a live Testnet payment. There is no sanctions or transaction-monitoring engine in the application.</w:t>
+        <w:t>The daily and monthly check reads current usage and then inserts the quote. Nothing locks the sender’s rows between those two steps, so two quotes submitted together can both pass and together exceed the cap. Settlement will not pay twice once the transaction hash has been saved. Before submitting, the worker looks up a validated Payment on the sending account whose memo is this remittance id and adopts that hash instead of paying again; the wallet is still credited if this process had not credited it yet. Two overlapping worker runs can still both miss the lookup and pay twice. The automated tests replace the ledger calls, so they do not show a live Testnet payment. There is no sanctions or transaction-monitoring engine in the application.</w:t>
       </w:r>
     </w:p>
     <w:p>

</xml_diff>